<commit_message>
4 templates: dieta caseira, racao, prescricao, exames
</commit_message>
<xml_diff>
--- a/templates/template_dieta_caseira.docx
+++ b/templates/template_dieta_caseira.docx
@@ -512,7 +512,7 @@
                 <w:color w:val="FFFFFF"/>
                 <w:sz w:val="22"/>
               </w:rPr>
-              <w:t>Qtd (g)</w:t>
+              <w:t>Qtd</w:t>
             </w:r>
           </w:p>
         </w:tc>
@@ -745,82 +745,6 @@
           </w:p>
         </w:tc>
       </w:tr>
-      <w:tr>
-        <w:trPr>
-          <w:trHeight w:val="720" w:hRule="atLeast"/>
-        </w:trPr>
-        <w:tc>
-          <w:tcPr>
-            <w:tcW w:w="7181" w:type="dxa"/>
-            <w:tcBorders>
-              <w:top w:val="single" w:sz="4" w:space="0" w:color="1A5276"/>
-              <w:left w:val="single" w:sz="4" w:space="0" w:color="1A5276"/>
-              <w:bottom w:val="single" w:sz="4" w:space="0" w:color="1A5276"/>
-              <w:right w:val="single" w:sz="4" w:space="0" w:color="1A5276"/>
-            </w:tcBorders>
-            <w:shd w:val="clear" w:color="auto" w:fill="D6EAF8"/>
-            <w:tcMar>
-              <w:top w:w="0" w:type="dxa"/>
-              <w:left w:w="160" w:type="dxa"/>
-              <w:bottom w:w="0" w:type="dxa"/>
-              <w:right w:w="160" w:type="dxa"/>
-            </w:tcMar>
-            <w:vAlign w:val="center"/>
-          </w:tcPr>
-          <w:p>
-            <w:pPr>
-              <w:spacing w:before="0" w:after="0"/>
-            </w:pPr>
-            <w:r/>
-            <w:r>
-              <w:rPr>
-                <w:rFonts w:ascii="Arial" w:hAnsi="Arial"/>
-                <w:b/>
-                <w:i w:val="0"/>
-                <w:color w:val="1A5276"/>
-                <w:sz w:val="22"/>
-              </w:rPr>
-              <w:t>TOTAL</w:t>
-            </w:r>
-          </w:p>
-        </w:tc>
-        <w:tc>
-          <w:tcPr>
-            <w:tcW w:w="2458" w:type="dxa"/>
-            <w:tcBorders>
-              <w:top w:val="single" w:sz="4" w:space="0" w:color="1A5276"/>
-              <w:left w:val="single" w:sz="4" w:space="0" w:color="1A5276"/>
-              <w:bottom w:val="single" w:sz="4" w:space="0" w:color="1A5276"/>
-              <w:right w:val="single" w:sz="4" w:space="0" w:color="1A5276"/>
-            </w:tcBorders>
-            <w:shd w:val="clear" w:color="auto" w:fill="D6EAF8"/>
-            <w:tcMar>
-              <w:top w:w="0" w:type="dxa"/>
-              <w:left w:w="160" w:type="dxa"/>
-              <w:bottom w:w="0" w:type="dxa"/>
-              <w:right w:w="160" w:type="dxa"/>
-            </w:tcMar>
-            <w:vAlign w:val="center"/>
-          </w:tcPr>
-          <w:p>
-            <w:pPr>
-              <w:jc w:val="center"/>
-              <w:spacing w:before="0" w:after="0"/>
-            </w:pPr>
-            <w:r/>
-            <w:r>
-              <w:rPr>
-                <w:rFonts w:ascii="Arial" w:hAnsi="Arial"/>
-                <w:b/>
-                <w:i w:val="0"/>
-                <w:color w:val="1A5276"/>
-                <w:sz w:val="22"/>
-              </w:rPr>
-              <w:t>---</w:t>
-            </w:r>
-          </w:p>
-        </w:tc>
-      </w:tr>
     </w:tbl>
     <w:p>
       <w:pPr>
@@ -895,21 +819,6 @@
           <w:rFonts w:ascii="Arial" w:hAnsi="Arial"/>
           <w:b/>
           <w:i w:val="0"/>
-          <w:color w:val="1A5276"/>
-          <w:sz w:val="24"/>
-        </w:rPr>
-        <w:t>HIGIENE E SEGURANÇA ALIMENTAR</w:t>
-      </w:r>
-    </w:p>
-    <w:p>
-      <w:pPr>
-        <w:spacing w:before="0" w:after="120"/>
-      </w:pPr>
-      <w:r>
-        <w:rPr>
-          <w:rFonts w:ascii="Arial" w:hAnsi="Arial"/>
-          <w:b/>
-          <w:i w:val="0"/>
           <w:color w:val="2E86C1"/>
           <w:sz w:val="21"/>
         </w:rPr>
@@ -948,8 +857,17 @@
     </w:p>
     <w:p>
       <w:pPr>
-        <w:spacing w:before="0" w:after="120"/>
+        <w:spacing w:before="0" w:after="50"/>
+        <w:ind w:left="360" w:hanging="180"/>
       </w:pPr>
+      <w:r>
+        <w:rPr>
+          <w:rFonts w:ascii="Arial" w:hAnsi="Arial"/>
+          <w:color w:val="1C2833"/>
+          <w:sz w:val="20"/>
+        </w:rPr>
+        <w:t xml:space="preserve">• </w:t>
+      </w:r>
       <w:r>
         <w:rPr>
           <w:rFonts w:ascii="Arial" w:hAnsi="Arial"/>
@@ -958,13 +876,22 @@
           <w:color w:val="1C2833"/>
           <w:sz w:val="20"/>
         </w:rPr>
-        <w:t>Não troque ingredientes nem mude quantidades. Toda a proporção foi calculada individualmente. Ajustes sem orientação podem desbalancear a dieta e prejudicar a saúde do animal. Forneça o suplemento apenas no momento de servir o alimento.</w:t>
+        <w:t>Não troque ingredientes nem mude quantidades.</w:t>
       </w:r>
     </w:p>
     <w:p>
       <w:pPr>
-        <w:spacing w:before="0" w:after="120"/>
+        <w:spacing w:before="0" w:after="50"/>
+        <w:ind w:left="360" w:hanging="180"/>
       </w:pPr>
+      <w:r>
+        <w:rPr>
+          <w:rFonts w:ascii="Arial" w:hAnsi="Arial"/>
+          <w:color w:val="1C2833"/>
+          <w:sz w:val="20"/>
+        </w:rPr>
+        <w:t xml:space="preserve">• </w:t>
+      </w:r>
       <w:r>
         <w:rPr>
           <w:rFonts w:ascii="Arial" w:hAnsi="Arial"/>
@@ -973,12 +900,36 @@
           <w:color w:val="1C2833"/>
           <w:sz w:val="20"/>
         </w:rPr>
-        <w:t>Evite contaminação cruzada: lave bem mãos, utensílios e superfícies entre o manuseio de carnes cruas e outros alimentos. Armazenamento: Geladeira: até 3 dias. Freezer: até 90 dias. Guarde sempre em recipientes limpos, bem vedados e em porções individuais para facilitar o uso.</w:t>
+        <w:t>Toda a proporção foi calculada individualmente. Ajustes sem orientação podem desbalancear a dieta e prejudicar a saúde do animal.</w:t>
       </w:r>
     </w:p>
     <w:p>
       <w:pPr>
-        <w:spacing w:before="0" w:after="60"/>
+        <w:spacing w:before="0" w:after="50"/>
+        <w:ind w:left="360" w:hanging="180"/>
+      </w:pPr>
+      <w:r>
+        <w:rPr>
+          <w:rFonts w:ascii="Arial" w:hAnsi="Arial"/>
+          <w:color w:val="1C2833"/>
+          <w:sz w:val="20"/>
+        </w:rPr>
+        <w:t xml:space="preserve">• </w:t>
+      </w:r>
+      <w:r>
+        <w:rPr>
+          <w:rFonts w:ascii="Arial" w:hAnsi="Arial"/>
+          <w:b w:val="0"/>
+          <w:i w:val="0"/>
+          <w:color w:val="1C2833"/>
+          <w:sz w:val="20"/>
+        </w:rPr>
+        <w:t>Forneça o suplemento apenas no momento de servir o alimento.</w:t>
+      </w:r>
+    </w:p>
+    <w:p>
+      <w:pPr>
+        <w:spacing w:before="80" w:after="60"/>
       </w:pPr>
       <w:r>
         <w:rPr>
@@ -993,8 +944,17 @@
     </w:p>
     <w:p>
       <w:pPr>
-        <w:spacing w:before="0" w:after="0"/>
+        <w:spacing w:before="0" w:after="50"/>
+        <w:ind w:left="360" w:hanging="180"/>
       </w:pPr>
+      <w:r>
+        <w:rPr>
+          <w:rFonts w:ascii="Arial" w:hAnsi="Arial"/>
+          <w:color w:val="1C2833"/>
+          <w:sz w:val="20"/>
+        </w:rPr>
+        <w:t xml:space="preserve">• </w:t>
+      </w:r>
       <w:r>
         <w:rPr>
           <w:rFonts w:ascii="Arial" w:hAnsi="Arial"/>
@@ -1003,7 +963,210 @@
           <w:color w:val="1C2833"/>
           <w:sz w:val="20"/>
         </w:rPr>
-        <w:t>Siga exatamente o indicado. A forma de preparo influencia diretamente na digestibilidade e aproveitamento dos nutrientes. Como pesar os ingredientes: pesar após o preparo. Cozido: Cozinhe em água, sem óleo, sem sal e sem temperos. Não utilize caldos prontos. Grãos devem ficar 12 horas de molho antes de cozinhar. Assado: Forno ou airfryer até 200 graus Celsius, sem óleo ou temperos. Refogado: Use apenas uma pequena quantidade de água para ajudar no cozimento. Nunca use óleo. Refogue por poucos minutos, com tampa, sem dourar.</w:t>
+        <w:t>Siga exatamente o indicado. A forma de preparo influencia diretamente na digestibilidade e aproveitamento dos nutrientes.</w:t>
+      </w:r>
+    </w:p>
+    <w:p>
+      <w:pPr>
+        <w:spacing w:before="0" w:after="50"/>
+        <w:ind w:left="360" w:hanging="180"/>
+      </w:pPr>
+      <w:r>
+        <w:rPr>
+          <w:rFonts w:ascii="Arial" w:hAnsi="Arial"/>
+          <w:color w:val="1C2833"/>
+          <w:sz w:val="20"/>
+        </w:rPr>
+        <w:t xml:space="preserve">• </w:t>
+      </w:r>
+      <w:r>
+        <w:rPr>
+          <w:rFonts w:ascii="Arial" w:hAnsi="Arial"/>
+          <w:b w:val="0"/>
+          <w:i w:val="0"/>
+          <w:color w:val="1C2833"/>
+          <w:sz w:val="20"/>
+        </w:rPr>
+        <w:t>Como pesar os ingredientes: pesar após o preparo.</w:t>
+      </w:r>
+    </w:p>
+    <w:p>
+      <w:pPr>
+        <w:spacing w:before="0" w:after="50"/>
+        <w:ind w:left="360" w:hanging="180"/>
+      </w:pPr>
+      <w:r>
+        <w:rPr>
+          <w:rFonts w:ascii="Arial" w:hAnsi="Arial"/>
+          <w:color w:val="1C2833"/>
+          <w:sz w:val="20"/>
+        </w:rPr>
+        <w:t xml:space="preserve">• </w:t>
+      </w:r>
+      <w:r>
+        <w:rPr>
+          <w:rFonts w:ascii="Arial" w:hAnsi="Arial"/>
+          <w:b w:val="0"/>
+          <w:i/>
+          <w:color w:val="1C2833"/>
+          <w:sz w:val="20"/>
+        </w:rPr>
+        <w:t>Cozido</w:t>
+      </w:r>
+      <w:r>
+        <w:rPr>
+          <w:rFonts w:ascii="Arial" w:hAnsi="Arial"/>
+          <w:b w:val="0"/>
+          <w:i w:val="0"/>
+          <w:color w:val="1C2833"/>
+          <w:sz w:val="20"/>
+        </w:rPr>
+        <w:t>: Cozinhe em água, sem óleo, sem sal e sem temperos. Não utilize caldos prontos. Grãos devem ficar 12 horas de molho antes de cozinhar.</w:t>
+      </w:r>
+    </w:p>
+    <w:p>
+      <w:pPr>
+        <w:spacing w:before="0" w:after="50"/>
+        <w:ind w:left="360" w:hanging="180"/>
+      </w:pPr>
+      <w:r>
+        <w:rPr>
+          <w:rFonts w:ascii="Arial" w:hAnsi="Arial"/>
+          <w:color w:val="1C2833"/>
+          <w:sz w:val="20"/>
+        </w:rPr>
+        <w:t xml:space="preserve">• </w:t>
+      </w:r>
+      <w:r>
+        <w:rPr>
+          <w:rFonts w:ascii="Arial" w:hAnsi="Arial"/>
+          <w:b w:val="0"/>
+          <w:i/>
+          <w:color w:val="1C2833"/>
+          <w:sz w:val="20"/>
+        </w:rPr>
+        <w:t>Assado:</w:t>
+      </w:r>
+      <w:r>
+        <w:rPr>
+          <w:rFonts w:ascii="Arial" w:hAnsi="Arial"/>
+          <w:b w:val="0"/>
+          <w:i w:val="0"/>
+          <w:color w:val="1C2833"/>
+          <w:sz w:val="20"/>
+        </w:rPr>
+        <w:t xml:space="preserve"> Forno ou airfryer até 200°C, sem óleo ou temperos.</w:t>
+      </w:r>
+    </w:p>
+    <w:p>
+      <w:pPr>
+        <w:spacing w:before="0" w:after="0"/>
+        <w:ind w:left="360" w:hanging="180"/>
+      </w:pPr>
+      <w:r>
+        <w:rPr>
+          <w:rFonts w:ascii="Arial" w:hAnsi="Arial"/>
+          <w:color w:val="1C2833"/>
+          <w:sz w:val="20"/>
+        </w:rPr>
+        <w:t xml:space="preserve">• </w:t>
+      </w:r>
+      <w:r>
+        <w:rPr>
+          <w:rFonts w:ascii="Arial" w:hAnsi="Arial"/>
+          <w:b w:val="0"/>
+          <w:i w:val="0"/>
+          <w:color w:val="1C2833"/>
+          <w:sz w:val="20"/>
+        </w:rPr>
+        <w:t>Refogado: Use apenas uma pequena quantidade de água para ajudar no cozimento. Nunca use óleo. Refogue por poucos minutos, com tampa, sem dourar.</w:t>
+      </w:r>
+    </w:p>
+    <w:p>
+      <w:pPr>
+        <w:spacing w:before="140" w:after="60"/>
+      </w:pPr>
+      <w:r>
+        <w:rPr>
+          <w:rFonts w:ascii="Arial" w:hAnsi="Arial"/>
+          <w:b/>
+          <w:i w:val="0"/>
+          <w:color w:val="1A5276"/>
+          <w:sz w:val="21"/>
+        </w:rPr>
+        <w:t>HIGIENE E SEGURANÇA ALIMENTAR</w:t>
+      </w:r>
+    </w:p>
+    <w:p>
+      <w:pPr>
+        <w:spacing w:before="0" w:after="50"/>
+        <w:ind w:left="360" w:hanging="180"/>
+      </w:pPr>
+      <w:r>
+        <w:rPr>
+          <w:rFonts w:ascii="Arial" w:hAnsi="Arial"/>
+          <w:color w:val="1C2833"/>
+          <w:sz w:val="20"/>
+        </w:rPr>
+        <w:t xml:space="preserve">• </w:t>
+      </w:r>
+      <w:r>
+        <w:rPr>
+          <w:rFonts w:ascii="Arial" w:hAnsi="Arial"/>
+          <w:b w:val="0"/>
+          <w:i w:val="0"/>
+          <w:color w:val="1C2833"/>
+          <w:sz w:val="20"/>
+        </w:rPr>
+        <w:t>Evite contaminação cruzada: lave bem mãos, utensílios e superfícies entre o manuseio de carnes cruas e outros alimentos.</w:t>
+      </w:r>
+    </w:p>
+    <w:p>
+      <w:pPr>
+        <w:spacing w:before="0" w:after="50"/>
+        <w:ind w:left="360" w:hanging="180"/>
+      </w:pPr>
+      <w:r>
+        <w:rPr>
+          <w:rFonts w:ascii="Arial" w:hAnsi="Arial"/>
+          <w:color w:val="1C2833"/>
+          <w:sz w:val="20"/>
+        </w:rPr>
+        <w:t xml:space="preserve">• </w:t>
+      </w:r>
+      <w:r>
+        <w:rPr>
+          <w:rFonts w:ascii="Arial" w:hAnsi="Arial"/>
+          <w:b w:val="0"/>
+          <w:i w:val="0"/>
+          <w:color w:val="1C2833"/>
+          <w:sz w:val="20"/>
+        </w:rPr>
+        <w:t>Armazenamento: Geladeira: até 3 dias. Freezer: até 90 dias.</w:t>
+      </w:r>
+    </w:p>
+    <w:p>
+      <w:pPr>
+        <w:spacing w:before="0" w:after="0"/>
+        <w:ind w:left="360" w:hanging="180"/>
+      </w:pPr>
+      <w:r>
+        <w:rPr>
+          <w:rFonts w:ascii="Arial" w:hAnsi="Arial"/>
+          <w:color w:val="1C2833"/>
+          <w:sz w:val="20"/>
+        </w:rPr>
+        <w:t xml:space="preserve">• </w:t>
+      </w:r>
+      <w:r>
+        <w:rPr>
+          <w:rFonts w:ascii="Arial" w:hAnsi="Arial"/>
+          <w:b w:val="0"/>
+          <w:i w:val="0"/>
+          <w:color w:val="1C2833"/>
+          <w:sz w:val="20"/>
+        </w:rPr>
+        <w:t>Guarde sempre em recipientes limpos, bem vedados e porções individuais para facilitar o uso.</w:t>
       </w:r>
     </w:p>
     <w:p>
@@ -1087,21 +1250,6 @@
     </w:p>
     <w:p>
       <w:pPr>
-        <w:spacing w:before="0" w:after="80"/>
-      </w:pPr>
-      <w:r>
-        <w:rPr>
-          <w:rFonts w:ascii="Arial" w:hAnsi="Arial"/>
-          <w:b/>
-          <w:i w:val="0"/>
-          <w:color w:val="1A5276"/>
-          <w:sz w:val="21"/>
-        </w:rPr>
-        <w:t>Orientação:</w:t>
-      </w:r>
-    </w:p>
-    <w:p>
-      <w:pPr>
         <w:spacing w:before="0" w:after="100"/>
       </w:pPr>
       <w:r>
@@ -1112,12 +1260,12 @@
           <w:color w:val="1C2833"/>
           <w:sz w:val="20"/>
         </w:rPr>
-        <w:t>Realizar a troca de forma progressiva ao longo de 7 dias. Misturar a comida caseira com a ração atual, aumentando a proporção da dieta caseira a cada dia:</w:t>
+        <w:t>A transição deve ser bem gradual, com o objetivo de permitir adaptação do trato gastrointestinal e evitar episódios de vômito, diarreia ou desconforto abdominal.</w:t>
       </w:r>
     </w:p>
     <w:p>
       <w:pPr>
-        <w:spacing w:before="0" w:after="40"/>
+        <w:spacing w:before="0" w:after="60"/>
       </w:pPr>
       <w:r>
         <w:rPr>
@@ -1127,13 +1275,22 @@
           <w:color w:val="1C2833"/>
           <w:sz w:val="20"/>
         </w:rPr>
-        <w:t>Dia 1 e 2: 75% dieta antiga + 25% dieta nova</w:t>
+        <w:t>Orientação:</w:t>
       </w:r>
     </w:p>
     <w:p>
       <w:pPr>
-        <w:spacing w:before="0" w:after="40"/>
+        <w:spacing w:before="0" w:after="50"/>
+        <w:ind w:left="360" w:hanging="180"/>
       </w:pPr>
+      <w:r>
+        <w:rPr>
+          <w:rFonts w:ascii="Arial" w:hAnsi="Arial"/>
+          <w:color w:val="1C2833"/>
+          <w:sz w:val="20"/>
+        </w:rPr>
+        <w:t xml:space="preserve">• </w:t>
+      </w:r>
       <w:r>
         <w:rPr>
           <w:rFonts w:ascii="Arial" w:hAnsi="Arial"/>
@@ -1142,13 +1299,22 @@
           <w:color w:val="1C2833"/>
           <w:sz w:val="20"/>
         </w:rPr>
-        <w:t>Dia 3 e 4: 50% dieta antiga + 50% dieta nova</w:t>
+        <w:t>Realizar a troca de forma progressiva ao longo de 7 dias.</w:t>
       </w:r>
     </w:p>
     <w:p>
       <w:pPr>
-        <w:spacing w:before="0" w:after="40"/>
+        <w:spacing w:before="0" w:after="80"/>
+        <w:ind w:left="360" w:hanging="180"/>
       </w:pPr>
+      <w:r>
+        <w:rPr>
+          <w:rFonts w:ascii="Arial" w:hAnsi="Arial"/>
+          <w:color w:val="1C2833"/>
+          <w:sz w:val="20"/>
+        </w:rPr>
+        <w:t xml:space="preserve">• </w:t>
+      </w:r>
       <w:r>
         <w:rPr>
           <w:rFonts w:ascii="Arial" w:hAnsi="Arial"/>
@@ -1157,37 +1323,71 @@
           <w:color w:val="1C2833"/>
           <w:sz w:val="20"/>
         </w:rPr>
+        <w:t>Misturar a dieta nova com a dieta antiga, aumentando a proporção a cada dia:</w:t>
+      </w:r>
+    </w:p>
+    <w:p>
+      <w:pPr>
+        <w:spacing w:before="0" w:after="30"/>
+        <w:ind w:left="360"/>
+      </w:pPr>
+      <w:r>
+        <w:rPr>
+          <w:rFonts w:ascii="Arial" w:hAnsi="Arial"/>
+          <w:b w:val="0"/>
+          <w:i/>
+          <w:color w:val="1C2833"/>
+          <w:sz w:val="20"/>
+        </w:rPr>
+        <w:t>Dia 1 e 2: 75% dieta antiga + 25% dieta nova</w:t>
+      </w:r>
+    </w:p>
+    <w:p>
+      <w:pPr>
+        <w:spacing w:before="0" w:after="30"/>
+        <w:ind w:left="360"/>
+      </w:pPr>
+      <w:r>
+        <w:rPr>
+          <w:rFonts w:ascii="Arial" w:hAnsi="Arial"/>
+          <w:b w:val="0"/>
+          <w:i/>
+          <w:color w:val="1C2833"/>
+          <w:sz w:val="20"/>
+        </w:rPr>
+        <w:t>Dia 3 e 4: 50% dieta antiga + 50% dieta nova</w:t>
+      </w:r>
+    </w:p>
+    <w:p>
+      <w:pPr>
+        <w:spacing w:before="0" w:after="30"/>
+        <w:ind w:left="360"/>
+      </w:pPr>
+      <w:r>
+        <w:rPr>
+          <w:rFonts w:ascii="Arial" w:hAnsi="Arial"/>
+          <w:b w:val="0"/>
+          <w:i/>
+          <w:color w:val="1C2833"/>
+          <w:sz w:val="20"/>
+        </w:rPr>
         <w:t>Dia 5 e 6: 25% dieta antiga + 75% dieta nova</w:t>
       </w:r>
     </w:p>
     <w:p>
       <w:pPr>
-        <w:spacing w:before="0" w:after="40"/>
+        <w:spacing w:before="0" w:after="30"/>
+        <w:ind w:left="360"/>
       </w:pPr>
       <w:r>
         <w:rPr>
           <w:rFonts w:ascii="Arial" w:hAnsi="Arial"/>
           <w:b w:val="0"/>
-          <w:i w:val="0"/>
+          <w:i/>
           <w:color w:val="1C2833"/>
           <w:sz w:val="20"/>
         </w:rPr>
         <w:t>Dia 7: 100% dieta nova</w:t>
-      </w:r>
-    </w:p>
-    <w:p>
-      <w:pPr>
-        <w:spacing w:before="100" w:after="0"/>
-      </w:pPr>
-      <w:r>
-        <w:rPr>
-          <w:rFonts w:ascii="Arial" w:hAnsi="Arial"/>
-          <w:b w:val="0"/>
-          <w:i w:val="0"/>
-          <w:color w:val="1C2833"/>
-          <w:sz w:val="20"/>
-        </w:rPr>
-        <w:t>A transição deve ser bem gradual, com o objetivo de permitir adaptação do trato gastrointestinal e evitar episódios de vômito, diarreia ou desconforto abdominal.</w:t>
       </w:r>
     </w:p>
     <w:sectPr>

</xml_diff>